<commit_message>
added a nice diagram explaining StableCoins
</commit_message>
<xml_diff>
--- a/4 - DeFi and Smart Contract Security.docx
+++ b/4 - DeFi and Smart Contract Security.docx
@@ -23982,11 +23982,70 @@
       </w:pPr>
       <w:bookmarkStart w:id="45" w:name="_Toc237868740"/>
       <w:r>
+        <w:lastRenderedPageBreak/>
         <w:t>StableCoin</w:t>
       </w:r>
       <w:bookmarkEnd w:id="45"/>
       <w:r>
         <w:t xml:space="preserve"> </w:t>
+      </w:r>
+    </w:p>
+    <w:p>
+      <w:r>
+        <w:drawing>
+          <wp:inline distT="0" distB="0" distL="0" distR="0" wp14:anchorId="366B91A7" wp14:editId="04244280">
+            <wp:extent cx="5118074" cy="7232607"/>
+            <wp:effectExtent l="190500" t="190500" r="197485" b="197485"/>
+            <wp:docPr id="1323377882" name="Picture 1"/>
+            <wp:cNvGraphicFramePr>
+              <a:graphicFrameLocks xmlns:a="http://schemas.openxmlformats.org/drawingml/2006/main" noChangeAspect="1"/>
+            </wp:cNvGraphicFramePr>
+            <a:graphic xmlns:a="http://schemas.openxmlformats.org/drawingml/2006/main">
+              <a:graphicData uri="http://schemas.openxmlformats.org/drawingml/2006/picture">
+                <pic:pic xmlns:pic="http://schemas.openxmlformats.org/drawingml/2006/picture">
+                  <pic:nvPicPr>
+                    <pic:cNvPr id="0" name="Picture 3"/>
+                    <pic:cNvPicPr>
+                      <a:picLocks noChangeAspect="1" noChangeArrowheads="1"/>
+                    </pic:cNvPicPr>
+                  </pic:nvPicPr>
+                  <pic:blipFill>
+                    <a:blip r:embed="rId36">
+                      <a:extLst>
+                        <a:ext uri="{28A0092B-C50C-407E-A947-70E740481C1C}">
+                          <a14:useLocalDpi xmlns:a14="http://schemas.microsoft.com/office/drawing/2010/main" val="0"/>
+                        </a:ext>
+                      </a:extLst>
+                    </a:blip>
+                    <a:srcRect/>
+                    <a:stretch>
+                      <a:fillRect/>
+                    </a:stretch>
+                  </pic:blipFill>
+                  <pic:spPr bwMode="auto">
+                    <a:xfrm>
+                      <a:off x="0" y="0"/>
+                      <a:ext cx="5126093" cy="7243939"/>
+                    </a:xfrm>
+                    <a:prstGeom prst="rect">
+                      <a:avLst/>
+                    </a:prstGeom>
+                    <a:ln>
+                      <a:noFill/>
+                    </a:ln>
+                    <a:effectLst>
+                      <a:outerShdw blurRad="190500" algn="tl" rotWithShape="0">
+                        <a:srgbClr val="000000">
+                          <a:alpha val="70000"/>
+                        </a:srgbClr>
+                      </a:outerShdw>
+                    </a:effectLst>
+                  </pic:spPr>
+                </pic:pic>
+              </a:graphicData>
+            </a:graphic>
+          </wp:inline>
+        </w:drawing>
       </w:r>
     </w:p>
     <w:p>
@@ -24009,6 +24068,7 @@
           <w:szCs w:val="22"/>
           <w14:ligatures w14:val="none"/>
         </w:rPr>
+        <w:lastRenderedPageBreak/>
         <w:t>Core mental model: a stablecoin is an ERC-20 token plus an economic mechanism whose job is to keep 1 token close to some target value, usually $1.</w:t>
       </w:r>
     </w:p>
@@ -24373,16 +24433,6 @@
           <w14:ligatures w14:val="none"/>
         </w:rPr>
         <w:br/>
-      </w:r>
-      <w:r>
-        <w:rPr>
-          <w:rFonts w:ascii="Consolas" w:eastAsia="Consolas" w:hAnsi="Consolas" w:cs="Arial"/>
-          <w:kern w:val="0"/>
-          <w:sz w:val="19"/>
-          <w:szCs w:val="22"/>
-          <w14:ligatures w14:val="none"/>
-        </w:rPr>
-        <w:lastRenderedPageBreak/>
         <w:t xml:space="preserve">                    because of...</w:t>
       </w:r>
       <w:r>
@@ -24655,6 +24705,7 @@
         <w:rPr>
           <w:rFonts w:eastAsia="Times New Roman"/>
         </w:rPr>
+        <w:lastRenderedPageBreak/>
         <w:t>3. Type #1 - Fiat-Backed Stablecoins</w:t>
       </w:r>
       <w:bookmarkEnd w:id="48"/>
@@ -25038,7 +25089,6 @@
           <w:szCs w:val="22"/>
           <w14:ligatures w14:val="none"/>
         </w:rPr>
-        <w:lastRenderedPageBreak/>
         <w:t>deposit $1   -&gt; mint about 1 PUSD</w:t>
       </w:r>
       <w:r>
@@ -25282,6 +25332,7 @@
           <w:szCs w:val="22"/>
           <w14:ligatures w14:val="none"/>
         </w:rPr>
+        <w:lastRenderedPageBreak/>
         <w:t>If the stablecoin trades above $1, the opposite incentive may appear: participants who can acquire or mint it near $1 can sell it above $1, adding supply and pushing the market price down.</w:t>
       </w:r>
     </w:p>
@@ -25881,14 +25932,25 @@
           <w14:ligatures w14:val="none"/>
         </w:rPr>
       </w:pPr>
-      <w:r>
-        <w:rPr>
-          <w:rFonts w:eastAsia="Times New Roman" w:cs="Times New Roman"/>
-          <w:noProof w:val="0"/>
-          <w:kern w:val="0"/>
-          <w14:ligatures w14:val="none"/>
-        </w:rPr>
-        <w:t>So the trader does:</w:t>
+      <w:proofErr w:type="gramStart"/>
+      <w:r>
+        <w:rPr>
+          <w:rFonts w:eastAsia="Times New Roman" w:cs="Times New Roman"/>
+          <w:noProof w:val="0"/>
+          <w:kern w:val="0"/>
+          <w14:ligatures w14:val="none"/>
+        </w:rPr>
+        <w:t>So</w:t>
+      </w:r>
+      <w:proofErr w:type="gramEnd"/>
+      <w:r>
+        <w:rPr>
+          <w:rFonts w:eastAsia="Times New Roman" w:cs="Times New Roman"/>
+          <w:noProof w:val="0"/>
+          <w:kern w:val="0"/>
+          <w14:ligatures w14:val="none"/>
+        </w:rPr>
+        <w:t xml:space="preserve"> the trader does:</w:t>
       </w:r>
     </w:p>
     <w:p>
@@ -27243,6 +27305,7 @@
           <w:szCs w:val="20"/>
           <w14:ligatures w14:val="none"/>
         </w:rPr>
+        <w:lastRenderedPageBreak/>
         <w:t>Trader</w:t>
       </w:r>
     </w:p>
@@ -27634,6 +27697,7 @@
         </w:rPr>
         <w:t xml:space="preserve">│ </w:t>
       </w:r>
+      <w:proofErr w:type="gramStart"/>
       <w:r>
         <w:rPr>
           <w:rFonts w:ascii="Consolas" w:eastAsia="Times New Roman" w:hAnsi="Consolas" w:cs="Courier New"/>
@@ -27656,7 +27720,20 @@
           <w:szCs w:val="20"/>
           <w14:ligatures w14:val="none"/>
         </w:rPr>
-        <w:t xml:space="preserve">  ↑            │</w:t>
+        <w:t xml:space="preserve">  ↑</w:t>
+      </w:r>
+      <w:proofErr w:type="gramEnd"/>
+      <w:r>
+        <w:rPr>
+          <w:rFonts w:ascii="Consolas" w:eastAsia="Times New Roman" w:hAnsi="Consolas" w:cs="Courier New"/>
+          <w:noProof w:val="0"/>
+          <w:color w:val="D8DEE6"/>
+          <w:kern w:val="0"/>
+          <w:sz w:val="20"/>
+          <w:szCs w:val="20"/>
+          <w14:ligatures w14:val="none"/>
+        </w:rPr>
+        <w:t xml:space="preserve">            │</w:t>
       </w:r>
     </w:p>
     <w:p>
@@ -27705,6 +27782,7 @@
         </w:rPr>
         <w:t xml:space="preserve">│ </w:t>
       </w:r>
+      <w:proofErr w:type="gramStart"/>
       <w:r>
         <w:rPr>
           <w:rFonts w:ascii="Consolas" w:eastAsia="Times New Roman" w:hAnsi="Consolas" w:cs="Courier New"/>
@@ -27727,7 +27805,20 @@
           <w:szCs w:val="20"/>
           <w14:ligatures w14:val="none"/>
         </w:rPr>
-        <w:t xml:space="preserve">  ↓            │</w:t>
+        <w:t xml:space="preserve">  ↓</w:t>
+      </w:r>
+      <w:proofErr w:type="gramEnd"/>
+      <w:r>
+        <w:rPr>
+          <w:rFonts w:ascii="Consolas" w:eastAsia="Times New Roman" w:hAnsi="Consolas" w:cs="Courier New"/>
+          <w:noProof w:val="0"/>
+          <w:color w:val="D8DEE6"/>
+          <w:kern w:val="0"/>
+          <w:sz w:val="20"/>
+          <w:szCs w:val="20"/>
+          <w14:ligatures w14:val="none"/>
+        </w:rPr>
+        <w:t xml:space="preserve">            │</w:t>
       </w:r>
     </w:p>
     <w:p>
@@ -28228,7 +28319,6 @@
           <w:szCs w:val="20"/>
           <w14:ligatures w14:val="none"/>
         </w:rPr>
-        <w:lastRenderedPageBreak/>
         <w:t>USDC</w:t>
       </w:r>
       <w:r>
@@ -29871,6 +29961,7 @@
           <w14:ligatures w14:val="none"/>
         </w:rPr>
       </w:pPr>
+      <w:proofErr w:type="gramStart"/>
       <w:r>
         <w:rPr>
           <w:rFonts w:ascii="Consolas" w:eastAsia="Times New Roman" w:hAnsi="Consolas" w:cs="Courier New"/>
@@ -29905,7 +29996,20 @@
           <w:szCs w:val="20"/>
           <w14:ligatures w14:val="none"/>
         </w:rPr>
-        <w:t>$0</w:t>
+        <w:t>$</w:t>
+      </w:r>
+      <w:proofErr w:type="gramEnd"/>
+      <w:r>
+        <w:rPr>
+          <w:rFonts w:ascii="Consolas" w:eastAsia="Times New Roman" w:hAnsi="Consolas" w:cs="Courier New"/>
+          <w:noProof w:val="0"/>
+          <w:color w:val="D8DEE6"/>
+          <w:kern w:val="0"/>
+          <w:sz w:val="20"/>
+          <w:szCs w:val="20"/>
+          <w14:ligatures w14:val="none"/>
+        </w:rPr>
+        <w:t>0</w:t>
       </w:r>
       <w:r>
         <w:rPr>
@@ -30011,6 +30115,7 @@
           <w:szCs w:val="20"/>
           <w14:ligatures w14:val="none"/>
         </w:rPr>
+        <w:lastRenderedPageBreak/>
         <w:t>Fees</w:t>
       </w:r>
       <w:r>
@@ -30955,7 +31060,6 @@
           <w:szCs w:val="20"/>
           <w14:ligatures w14:val="none"/>
         </w:rPr>
-        <w:lastRenderedPageBreak/>
         <w:t>Trader</w:t>
       </w:r>
     </w:p>
@@ -31520,14 +31624,25 @@
           <w14:ligatures w14:val="none"/>
         </w:rPr>
       </w:pPr>
-      <w:r>
-        <w:rPr>
-          <w:rFonts w:eastAsia="Times New Roman" w:cs="Times New Roman"/>
-          <w:noProof w:val="0"/>
-          <w:kern w:val="0"/>
-          <w14:ligatures w14:val="none"/>
-        </w:rPr>
-        <w:t xml:space="preserve">Therefore </w:t>
+      <w:proofErr w:type="gramStart"/>
+      <w:r>
+        <w:rPr>
+          <w:rFonts w:eastAsia="Times New Roman" w:cs="Times New Roman"/>
+          <w:noProof w:val="0"/>
+          <w:kern w:val="0"/>
+          <w14:ligatures w14:val="none"/>
+        </w:rPr>
+        <w:t>Therefore</w:t>
+      </w:r>
+      <w:proofErr w:type="gramEnd"/>
+      <w:r>
+        <w:rPr>
+          <w:rFonts w:eastAsia="Times New Roman" w:cs="Times New Roman"/>
+          <w:noProof w:val="0"/>
+          <w:kern w:val="0"/>
+          <w14:ligatures w14:val="none"/>
+        </w:rPr>
+        <w:t xml:space="preserve"> </w:t>
       </w:r>
       <w:r>
         <w:rPr>
@@ -32122,6 +32237,7 @@
           <w:kern w:val="0"/>
           <w14:ligatures w14:val="none"/>
         </w:rPr>
+        <w:lastRenderedPageBreak/>
         <w:t>Circle's 1:1 issuance/redemption mechanism provides the important economic anchor here. Direct access has eligibility requirements; not literally every random wallet can mint/redeem directly with Circle, but professional market makers and other participants can connect the on-chain and dollar markets.</w:t>
       </w:r>
     </w:p>
@@ -32138,6 +32254,7 @@
           <w14:ligatures w14:val="none"/>
         </w:rPr>
       </w:pPr>
+      <w:proofErr w:type="gramStart"/>
       <w:r>
         <w:rPr>
           <w:rFonts w:eastAsia="Times New Roman" w:cs="Times New Roman"/>
@@ -32148,7 +32265,20 @@
           <w:kern w:val="0"/>
           <w14:ligatures w14:val="none"/>
         </w:rPr>
-        <w:t>So for a fiat-backed stablecoin like USDC, the real peg mechanism is essentially:</w:t>
+        <w:t>So</w:t>
+      </w:r>
+      <w:proofErr w:type="gramEnd"/>
+      <w:r>
+        <w:rPr>
+          <w:rFonts w:eastAsia="Times New Roman" w:cs="Times New Roman"/>
+          <w:b/>
+          <w:bCs/>
+          <w:noProof w:val="0"/>
+          <w:color w:val="EE0000"/>
+          <w:kern w:val="0"/>
+          <w14:ligatures w14:val="none"/>
+        </w:rPr>
+        <w:t xml:space="preserve"> for a fiat-backed stablecoin like USDC, the real peg mechanism is essentially:</w:t>
       </w:r>
     </w:p>
     <w:p>
@@ -32383,19 +32513,45 @@
           <w:szCs w:val="20"/>
           <w14:ligatures w14:val="none"/>
         </w:rPr>
-        <w:t xml:space="preserve">creates arbitrage opportunity when market </w:t>
-      </w:r>
+        <w:t xml:space="preserve">creates arbitrage opportunity when </w:t>
+      </w:r>
+      <w:proofErr w:type="gramStart"/>
       <w:r>
         <w:rPr>
           <w:rFonts w:ascii="Consolas" w:eastAsia="Times New Roman" w:hAnsi="Consolas" w:cs="Courier New"/>
           <w:noProof w:val="0"/>
+          <w:color w:val="D8DEE6"/>
+          <w:kern w:val="0"/>
+          <w:sz w:val="20"/>
+          <w:szCs w:val="20"/>
+          <w14:ligatures w14:val="none"/>
+        </w:rPr>
+        <w:t xml:space="preserve">market </w:t>
+      </w:r>
+      <w:r>
+        <w:rPr>
+          <w:rFonts w:ascii="Consolas" w:eastAsia="Times New Roman" w:hAnsi="Consolas" w:cs="Courier New"/>
+          <w:noProof w:val="0"/>
           <w:color w:val="B85C40"/>
           <w:kern w:val="0"/>
           <w:sz w:val="20"/>
           <w:szCs w:val="20"/>
           <w14:ligatures w14:val="none"/>
         </w:rPr>
-        <w:t>!=</w:t>
+        <w:t>!</w:t>
+      </w:r>
+      <w:proofErr w:type="gramEnd"/>
+      <w:r>
+        <w:rPr>
+          <w:rFonts w:ascii="Consolas" w:eastAsia="Times New Roman" w:hAnsi="Consolas" w:cs="Courier New"/>
+          <w:noProof w:val="0"/>
+          <w:color w:val="B85C40"/>
+          <w:kern w:val="0"/>
+          <w:sz w:val="20"/>
+          <w:szCs w:val="20"/>
+          <w14:ligatures w14:val="none"/>
+        </w:rPr>
+        <w:t>=</w:t>
       </w:r>
       <w:r>
         <w:rPr>
@@ -32797,7 +32953,31 @@
           <w:szCs w:val="28"/>
           <w:u w:val="single"/>
         </w:rPr>
-        <w:t xml:space="preserve">, not an ERC-20. For example, Circle's system conceptually says: give Circle $1 in the banking system → receive 1 USDC; return 1 USDC → receive about $1 in the banking system. So the physical/digital bank dollars are held </w:t>
+        <w:t xml:space="preserve">, not an ERC-20. For example, Circle's system conceptually says: give Circle $1 in the banking system → receive 1 USDC; return 1 USDC → receive about $1 in the banking system. </w:t>
+      </w:r>
+      <w:proofErr w:type="gramStart"/>
+      <w:r>
+        <w:rPr>
+          <w:b/>
+          <w:bCs/>
+          <w:color w:val="EE0000"/>
+          <w:sz w:val="28"/>
+          <w:szCs w:val="28"/>
+          <w:u w:val="single"/>
+        </w:rPr>
+        <w:t>So</w:t>
+      </w:r>
+      <w:proofErr w:type="gramEnd"/>
+      <w:r>
+        <w:rPr>
+          <w:b/>
+          <w:bCs/>
+          <w:color w:val="EE0000"/>
+          <w:sz w:val="28"/>
+          <w:szCs w:val="28"/>
+          <w:u w:val="single"/>
+        </w:rPr>
+        <w:t xml:space="preserve"> the physical/digital bank dollars are held </w:t>
       </w:r>
       <w:r>
         <w:rPr>
@@ -32845,7 +33025,6 @@
           <w:szCs w:val="28"/>
           <w:u w:val="single"/>
         </w:rPr>
-        <w:lastRenderedPageBreak/>
         <w:t xml:space="preserve">Bots don't read some Solidity variable saying </w:t>
       </w:r>
       <w:r>
@@ -32915,7 +33094,31 @@
           <w:szCs w:val="28"/>
           <w:u w:val="single"/>
         </w:rPr>
-        <w:t xml:space="preserve">, but both USDC and USDT can ultimately be exchanged around $1 through their issuers/fiat markets, that mismatch can be profitable. So the </w:t>
+        <w:t xml:space="preserve">, but both USDC and USDT can ultimately be exchanged around $1 through their issuers/fiat markets, that mismatch can be profitable. </w:t>
+      </w:r>
+      <w:proofErr w:type="gramStart"/>
+      <w:r>
+        <w:rPr>
+          <w:b/>
+          <w:bCs/>
+          <w:color w:val="EE0000"/>
+          <w:sz w:val="28"/>
+          <w:szCs w:val="28"/>
+          <w:u w:val="single"/>
+        </w:rPr>
+        <w:t>So</w:t>
+      </w:r>
+      <w:proofErr w:type="gramEnd"/>
+      <w:r>
+        <w:rPr>
+          <w:b/>
+          <w:bCs/>
+          <w:color w:val="EE0000"/>
+          <w:sz w:val="28"/>
+          <w:szCs w:val="28"/>
+          <w:u w:val="single"/>
+        </w:rPr>
+        <w:t xml:space="preserve"> the </w:t>
       </w:r>
       <w:r>
         <w:rPr>
@@ -33076,6 +33279,7 @@
           <w:szCs w:val="22"/>
           <w14:ligatures w14:val="none"/>
         </w:rPr>
+        <w:lastRenderedPageBreak/>
         <w:t>A MYTOKEN/USDC pool is easier to read because USDC is intended to be close to $1.</w:t>
       </w:r>
     </w:p>
@@ -33393,7 +33597,6 @@
           <w:szCs w:val="22"/>
           <w14:ligatures w14:val="none"/>
         </w:rPr>
-        <w:lastRenderedPageBreak/>
         <w:br/>
         <w:t>Collateral ratio = $2,000 / $1,000 = 200%</w:t>
       </w:r>
@@ -33625,6 +33828,7 @@
         <w:rPr>
           <w:rStyle w:val="Heading2Char"/>
         </w:rPr>
+        <w:lastRenderedPageBreak/>
         <w:t>8.</w:t>
       </w:r>
       <w:r>
@@ -33864,7 +34068,6 @@
         <w:rPr>
           <w:rFonts w:eastAsia="Times New Roman"/>
         </w:rPr>
-        <w:lastRenderedPageBreak/>
         <w:t>1</w:t>
       </w:r>
       <w:r>
@@ -34129,6 +34332,16 @@
           <w14:ligatures w14:val="none"/>
         </w:rPr>
         <w:br/>
+      </w:r>
+      <w:r>
+        <w:rPr>
+          <w:rFonts w:ascii="Consolas" w:eastAsia="Consolas" w:hAnsi="Consolas" w:cs="Arial"/>
+          <w:kern w:val="0"/>
+          <w:sz w:val="19"/>
+          <w:szCs w:val="22"/>
+          <w14:ligatures w14:val="none"/>
+        </w:rPr>
+        <w:lastRenderedPageBreak/>
         <w:t>if price &gt; $1:</w:t>
       </w:r>
       <w:r>
@@ -34512,7 +34725,6 @@
           <w:szCs w:val="22"/>
           <w14:ligatures w14:val="none"/>
         </w:rPr>
-        <w:lastRenderedPageBreak/>
         <w:t>Backing: the assets or mechanisms supporting that target.</w:t>
       </w:r>
       <w:r>
@@ -34972,6 +35184,7 @@
           <w:szCs w:val="22"/>
           <w14:ligatures w14:val="none"/>
         </w:rPr>
+        <w:lastRenderedPageBreak/>
         <w:t>Arbitrage</w:t>
       </w:r>
       <w:r>
@@ -38211,6 +38424,7 @@
   <w:style w:type="character" w:default="1" w:styleId="DefaultParagraphFont">
     <w:name w:val="Default Paragraph Font"/>
     <w:uiPriority w:val="1"/>
+    <w:semiHidden/>
     <w:unhideWhenUsed/>
   </w:style>
   <w:style w:type="table" w:default="1" w:styleId="TableNormal">

</xml_diff>